<commit_message>
Demo script: remove tech-stack/terminal talk (Vite, Flask, architecture), reframe as pure system-usage demo for the panel
</commit_message>
<xml_diff>
--- a/Hotel Ava - Demo Presentation Script.docx
+++ b/Hotel Ava - Demo Presentation Script.docx
@@ -572,7 +572,7 @@
                 <w:i w:val="0"/>
                 <w:sz w:val="20"/>
               </w:rPr>
-              <w:t xml:space="preserve"> — Tech + Q&amp;A</w:t>
+              <w:t xml:space="preserve"> — Paano Gumagana + Q&amp;A</w:t>
             </w:r>
           </w:p>
         </w:tc>
@@ -606,7 +606,7 @@
                 <w:i w:val="0"/>
                 <w:sz w:val="20"/>
               </w:rPr>
-              <w:t>Architecture, AI, security, Q&amp;A</w:t>
+              <w:t>System flow, AI features, Q&amp;A</w:t>
             </w:r>
           </w:p>
         </w:tc>
@@ -710,49 +710,35 @@
           <w:b w:val="0"/>
           <w:i w:val="0"/>
         </w:rPr>
-        <w:t xml:space="preserve">1.  Sa terminal sa `D:\HotelAva`, patakbuhin ang </w:t>
+        <w:t xml:space="preserve">1.  I-set up ang system </w:t>
       </w:r>
       <w:r>
         <w:rPr>
           <w:b/>
           <w:i w:val="0"/>
         </w:rPr>
-        <w:t>`npm run dev`</w:t>
+        <w:t>bago pa magsimula</w:t>
       </w:r>
       <w:r>
         <w:rPr>
           <w:b w:val="0"/>
           <w:i w:val="0"/>
         </w:rPr>
-        <w:t xml:space="preserve"> — sabay ang Flask (`:5000`) at Vite (`:5173`). Hintayin ang </w:t>
+        <w:t xml:space="preserve"> — dapat </w:t>
       </w:r>
       <w:r>
         <w:rPr>
           <w:b/>
           <w:i w:val="0"/>
         </w:rPr>
-        <w:t>“VITE ready”</w:t>
+        <w:t>bukas na at gumagana</w:t>
       </w:r>
       <w:r>
         <w:rPr>
           <w:b w:val="0"/>
           <w:i w:val="0"/>
         </w:rPr>
-        <w:t xml:space="preserve"> at </w:t>
-      </w:r>
-      <w:r>
-        <w:rPr>
-          <w:b/>
-          <w:i w:val="0"/>
-        </w:rPr>
-        <w:t>“Debugger is active”</w:t>
-      </w:r>
-      <w:r>
-        <w:rPr>
-          <w:b w:val="0"/>
-          <w:i w:val="0"/>
-        </w:rPr>
-        <w:t>.</w:t>
+        <w:t xml:space="preserve"> ang app sa browser. Walang aayusin o iia-launch sa harap ng panel.</w:t>
       </w:r>
     </w:p>
     <w:p>
@@ -765,7 +751,7 @@
           <w:b w:val="0"/>
           <w:i w:val="0"/>
         </w:rPr>
-        <w:t xml:space="preserve">2.  Browser → `http://localhost:5173` — </w:t>
+        <w:t xml:space="preserve">2.  Buksan ang app sa browser: `http://localhost:5173` — </w:t>
       </w:r>
       <w:r>
         <w:rPr>
@@ -779,7 +765,7 @@
           <w:b w:val="0"/>
           <w:i w:val="0"/>
         </w:rPr>
-        <w:t xml:space="preserve"> (Ctrl+Shift+R).</w:t>
+        <w:t xml:space="preserve"> (Ctrl+Shift+R) para fresh ang lahat.</w:t>
       </w:r>
     </w:p>
     <w:p>
@@ -1433,7 +1419,7 @@
         <w:pStyle w:val="Heading3"/>
       </w:pPr>
       <w:r>
-        <w:t>Ano ang Technology sa Likod (sabihin nang mabilis)</w:t>
+        <w:t>Ano ang Kaya ng System (sabihin nang mabilis)</w:t>
       </w:r>
     </w:p>
     <w:p>
@@ -1453,14 +1439,28 @@
           <w:b/>
           <w:i w:val="0"/>
         </w:rPr>
-        <w:t>Frontend:</w:t>
+        <w:t>Real-time na availability</w:t>
       </w:r>
       <w:r>
         <w:rPr>
           <w:b w:val="0"/>
           <w:i w:val="0"/>
         </w:rPr>
-        <w:t xml:space="preserve"> React + TypeScript + Tailwind CSS — mabilis, moderno, responsive sa phone.</w:t>
+        <w:t xml:space="preserve"> — kapag okupado na ang room sa isang petsa/oras, hindi na ito mabook ulit — </w:t>
+      </w:r>
+      <w:r>
+        <w:rPr>
+          <w:b/>
+          <w:i w:val="0"/>
+        </w:rPr>
+        <w:t>double booking-proof</w:t>
+      </w:r>
+      <w:r>
+        <w:rPr>
+          <w:b w:val="0"/>
+          <w:i w:val="0"/>
+        </w:rPr>
+        <w:t>.</w:t>
       </w:r>
     </w:p>
     <w:p>
@@ -1480,14 +1480,56 @@
           <w:b/>
           <w:i w:val="0"/>
         </w:rPr>
-        <w:t>Backend:</w:t>
+        <w:t>Dalawang paraan ng booking:</w:t>
       </w:r>
       <w:r>
         <w:rPr>
           <w:b w:val="0"/>
           <w:i w:val="0"/>
         </w:rPr>
-        <w:t xml:space="preserve"> Python (Flask) REST API — lahat ng booking logic dito.</w:t>
+        <w:t xml:space="preserve"> online (guest) at </w:t>
+      </w:r>
+      <w:r>
+        <w:rPr>
+          <w:b/>
+          <w:i w:val="0"/>
+        </w:rPr>
+        <w:t>walk-in</w:t>
+      </w:r>
+      <w:r>
+        <w:rPr>
+          <w:b w:val="0"/>
+          <w:i w:val="0"/>
+        </w:rPr>
+        <w:t xml:space="preserve"> (admin sa counter) — sakop ang </w:t>
+      </w:r>
+      <w:r>
+        <w:rPr>
+          <w:b/>
+          <w:i w:val="0"/>
+        </w:rPr>
+        <w:t>overnight</w:t>
+      </w:r>
+      <w:r>
+        <w:rPr>
+          <w:b w:val="0"/>
+          <w:i w:val="0"/>
+        </w:rPr>
+        <w:t xml:space="preserve"> at ang </w:t>
+      </w:r>
+      <w:r>
+        <w:rPr>
+          <w:b/>
+          <w:i w:val="0"/>
+        </w:rPr>
+        <w:t>day use</w:t>
+      </w:r>
+      <w:r>
+        <w:rPr>
+          <w:b w:val="0"/>
+          <w:i w:val="0"/>
+        </w:rPr>
+        <w:t xml:space="preserve"> (per-oras).</w:t>
       </w:r>
     </w:p>
     <w:p>
@@ -1507,14 +1549,28 @@
           <w:b/>
           <w:i w:val="0"/>
         </w:rPr>
-        <w:t>Database:</w:t>
+        <w:t>Online payment</w:t>
       </w:r>
       <w:r>
         <w:rPr>
           <w:b w:val="0"/>
           <w:i w:val="0"/>
         </w:rPr>
-        <w:t xml:space="preserve"> Supabase PostgreSQL na naka-cloud — ligtas at laging updated.</w:t>
+        <w:t xml:space="preserve"> via PayMongo — full payment o 50% downpayment, at </w:t>
+      </w:r>
+      <w:r>
+        <w:rPr>
+          <w:b/>
+          <w:i w:val="0"/>
+        </w:rPr>
+        <w:t>automatic refund</w:t>
+      </w:r>
+      <w:r>
+        <w:rPr>
+          <w:b w:val="0"/>
+          <w:i w:val="0"/>
+        </w:rPr>
+        <w:t xml:space="preserve"> kapag nagkansela nang maaga.</w:t>
       </w:r>
     </w:p>
     <w:p>
@@ -1534,14 +1590,28 @@
           <w:b/>
           <w:i w:val="0"/>
         </w:rPr>
-        <w:t>Payments:</w:t>
+        <w:t>QR check-in</w:t>
       </w:r>
       <w:r>
         <w:rPr>
           <w:b w:val="0"/>
           <w:i w:val="0"/>
         </w:rPr>
-        <w:t xml:space="preserve"> PayMongo para sa online payment at refund.</w:t>
+        <w:t xml:space="preserve"> para sa online bookings at </w:t>
+      </w:r>
+      <w:r>
+        <w:rPr>
+          <w:b/>
+          <w:i w:val="0"/>
+        </w:rPr>
+        <w:t>auto in-house</w:t>
+      </w:r>
+      <w:r>
+        <w:rPr>
+          <w:b w:val="0"/>
+          <w:i w:val="0"/>
+        </w:rPr>
+        <w:t xml:space="preserve"> sa walk-in — mabilis sa front desk.</w:t>
       </w:r>
     </w:p>
     <w:p>
@@ -1561,22 +1631,14 @@
           <w:b/>
           <w:i w:val="0"/>
         </w:rPr>
-        <w:t>AI:</w:t>
+        <w:t>Admin dashboard</w:t>
       </w:r>
       <w:r>
         <w:rPr>
           <w:b w:val="0"/>
           <w:i w:val="0"/>
         </w:rPr>
-        <w:t xml:space="preserve"> Ask Ava chat, revenue forecast, at room recommendations.</w:t>
-      </w:r>
-    </w:p>
-    <w:p>
-      <w:pPr>
-        <w:pStyle w:val="Heading3"/>
-      </w:pPr>
-      <w:r>
-        <w:t>Overview ng Ipapakita (read-through lang)</w:t>
+        <w:t xml:space="preserve"> — bookings, rooms, guests, reviews, at analytics sa isang tingin.</w:t>
       </w:r>
     </w:p>
     <w:p>
@@ -1596,28 +1658,22 @@
           <w:b/>
           <w:i w:val="0"/>
         </w:rPr>
-        <w:t>User side (Person 2):</w:t>
+        <w:t>AI:</w:t>
       </w:r>
       <w:r>
         <w:rPr>
           <w:b w:val="0"/>
           <w:i w:val="0"/>
         </w:rPr>
-        <w:t xml:space="preserve"> room search at filters → room details → booking (overnight o </w:t>
-      </w:r>
-      <w:r>
-        <w:rPr>
-          <w:b/>
-          <w:i w:val="0"/>
-        </w:rPr>
-        <w:t>day use</w:t>
-      </w:r>
-      <w:r>
-        <w:rPr>
-          <w:b w:val="0"/>
-          <w:i w:val="0"/>
-        </w:rPr>
-        <w:t>) → price breakdown → My Bookings + QR → Ask Ava AI.</w:t>
+        <w:t xml:space="preserve"> Ask Ava chat, revenue forecast, at room recommendations — batay sa totoong datos.</w:t>
+      </w:r>
+    </w:p>
+    <w:p>
+      <w:pPr>
+        <w:pStyle w:val="Heading3"/>
+      </w:pPr>
+      <w:r>
+        <w:t>Overview ng Ipapakita (read-through lang)</w:t>
       </w:r>
     </w:p>
     <w:p>
@@ -1637,42 +1693,28 @@
           <w:b/>
           <w:i w:val="0"/>
         </w:rPr>
-        <w:t>Admin side (Person 3):</w:t>
+        <w:t>User side (Person 2):</w:t>
       </w:r>
       <w:r>
         <w:rPr>
           <w:b w:val="0"/>
           <w:i w:val="0"/>
         </w:rPr>
-        <w:t xml:space="preserve"> dashboard at analytics → bookings table → </w:t>
+        <w:t xml:space="preserve"> room search at filters → room details → booking (overnight o </w:t>
       </w:r>
       <w:r>
         <w:rPr>
           <w:b/>
           <w:i w:val="0"/>
         </w:rPr>
-        <w:t>walk-in booking</w:t>
+        <w:t>day use</w:t>
       </w:r>
       <w:r>
         <w:rPr>
           <w:b w:val="0"/>
           <w:i w:val="0"/>
         </w:rPr>
-        <w:t xml:space="preserve"> → </w:t>
-      </w:r>
-      <w:r>
-        <w:rPr>
-          <w:b/>
-          <w:i w:val="0"/>
-        </w:rPr>
-        <w:t>double-booking guard</w:t>
-      </w:r>
-      <w:r>
-        <w:rPr>
-          <w:b w:val="0"/>
-          <w:i w:val="0"/>
-        </w:rPr>
-        <w:t>.</w:t>
+        <w:t>) → price breakdown → My Bookings + QR → Ask Ava AI.</w:t>
       </w:r>
     </w:p>
     <w:p>
@@ -1692,14 +1734,69 @@
           <w:b/>
           <w:i w:val="0"/>
         </w:rPr>
-        <w:t>Tech (Person 4):</w:t>
+        <w:t>Admin side (Person 3):</w:t>
       </w:r>
       <w:r>
         <w:rPr>
           <w:b w:val="0"/>
           <w:i w:val="0"/>
         </w:rPr>
-        <w:t xml:space="preserve"> architecture, AI, at seguridad → Q&amp;A.</w:t>
+        <w:t xml:space="preserve"> dashboard at analytics → bookings table → </w:t>
+      </w:r>
+      <w:r>
+        <w:rPr>
+          <w:b/>
+          <w:i w:val="0"/>
+        </w:rPr>
+        <w:t>walk-in booking</w:t>
+      </w:r>
+      <w:r>
+        <w:rPr>
+          <w:b w:val="0"/>
+          <w:i w:val="0"/>
+        </w:rPr>
+        <w:t xml:space="preserve"> → </w:t>
+      </w:r>
+      <w:r>
+        <w:rPr>
+          <w:b/>
+          <w:i w:val="0"/>
+        </w:rPr>
+        <w:t>double-booking guard</w:t>
+      </w:r>
+      <w:r>
+        <w:rPr>
+          <w:b w:val="0"/>
+          <w:i w:val="0"/>
+        </w:rPr>
+        <w:t>.</w:t>
+      </w:r>
+    </w:p>
+    <w:p>
+      <w:pPr>
+        <w:spacing w:after="60"/>
+        <w:ind w:left="432"/>
+      </w:pPr>
+      <w:r>
+        <w:rPr>
+          <w:b w:val="0"/>
+          <w:i w:val="0"/>
+        </w:rPr>
+        <w:t xml:space="preserve">•  </w:t>
+      </w:r>
+      <w:r>
+        <w:rPr>
+          <w:b/>
+          <w:i w:val="0"/>
+        </w:rPr>
+        <w:t>Person 4:</w:t>
+      </w:r>
+      <w:r>
+        <w:rPr>
+          <w:b w:val="0"/>
+          <w:i w:val="0"/>
+        </w:rPr>
+        <w:t xml:space="preserve"> paano gumagana ang buong system, AI features, at Q&amp;A.</w:t>
       </w:r>
     </w:p>
     <w:p>
@@ -3840,7 +3937,7 @@
           <w:b w:val="0"/>
           <w:i w:val="0"/>
         </w:rPr>
-        <w:t xml:space="preserve"> ang teknolohiya sa likod ng lahat ng ito.”</w:t>
+        <w:t xml:space="preserve"> kung paano gumagana ang buong system at ang AI nito.”</w:t>
       </w:r>
     </w:p>
     <w:p>
@@ -3853,7 +3950,7 @@
         <w:pStyle w:val="Heading1"/>
       </w:pPr>
       <w:r>
-        <w:t>Person 4 — Tech, AI at Q&amp;A (3–4 min)</w:t>
+        <w:t>Person 4 — Paano Gumagana, AI at Q&amp;A (3–4 min)</w:t>
       </w:r>
     </w:p>
     <w:p>
@@ -3861,7 +3958,7 @@
         <w:pStyle w:val="Heading2"/>
       </w:pPr>
       <w:r>
-        <w:t>Architecture (sabihin nang confident)</w:t>
+        <w:t>Paano Gumagana ang System (buong daloy — sabihin nang confident)</w:t>
       </w:r>
     </w:p>
     <w:p>
@@ -3881,13 +3978,55 @@
           <w:b/>
           <w:i w:val="0"/>
         </w:rPr>
-        <w:t>React SPA</w:t>
+        <w:t>Booking lifecycle:</w:t>
       </w:r>
       <w:r>
         <w:rPr>
           <w:b w:val="0"/>
           <w:i w:val="0"/>
         </w:rPr>
+        <w:t xml:space="preserve"> mag-search ng room → piliin ang </w:t>
+      </w:r>
+      <w:r>
+        <w:rPr>
+          <w:b/>
+          <w:i w:val="0"/>
+        </w:rPr>
+        <w:t>petsa/o oras</w:t>
+      </w:r>
+      <w:r>
+        <w:rPr>
+          <w:b w:val="0"/>
+          <w:i w:val="0"/>
+        </w:rPr>
+        <w:t xml:space="preserve"> → tingnan ang </w:t>
+      </w:r>
+      <w:r>
+        <w:rPr>
+          <w:b/>
+          <w:i w:val="0"/>
+        </w:rPr>
+        <w:t>price breakdown</w:t>
+      </w:r>
+      <w:r>
+        <w:rPr>
+          <w:b w:val="0"/>
+          <w:i w:val="0"/>
+        </w:rPr>
+        <w:t xml:space="preserve"> → bayad (full o 50% downpayment) → confirmation + </w:t>
+      </w:r>
+      <w:r>
+        <w:rPr>
+          <w:b/>
+          <w:i w:val="0"/>
+        </w:rPr>
+        <w:t>QR code</w:t>
+      </w:r>
+      <w:r>
+        <w:rPr>
+          <w:b w:val="0"/>
+          <w:i w:val="0"/>
+        </w:rPr>
         <w:t xml:space="preserve"> → </w:t>
       </w:r>
       <w:r>
@@ -3895,28 +4034,28 @@
           <w:b/>
           <w:i w:val="0"/>
         </w:rPr>
-        <w:t>Flask REST API</w:t>
+        <w:t>check-in</w:t>
       </w:r>
       <w:r>
         <w:rPr>
           <w:b w:val="0"/>
           <w:i w:val="0"/>
         </w:rPr>
-        <w:t xml:space="preserve"> → </w:t>
+        <w:t xml:space="preserve"> → stay → </w:t>
       </w:r>
       <w:r>
         <w:rPr>
           <w:b/>
           <w:i w:val="0"/>
         </w:rPr>
-        <w:t>Supabase PostgreSQL</w:t>
+        <w:t>review</w:t>
       </w:r>
       <w:r>
         <w:rPr>
           <w:b w:val="0"/>
           <w:i w:val="0"/>
         </w:rPr>
-        <w:t xml:space="preserve"> — malinis na tatlong layer.</w:t>
+        <w:t xml:space="preserve"> ng guest.</w:t>
       </w:r>
     </w:p>
     <w:p>
@@ -3936,28 +4075,56 @@
           <w:b/>
           <w:i w:val="0"/>
         </w:rPr>
-        <w:t>Auth:</w:t>
+        <w:t>Availability guard:</w:t>
       </w:r>
       <w:r>
         <w:rPr>
           <w:b w:val="0"/>
           <w:i w:val="0"/>
         </w:rPr>
-        <w:t xml:space="preserve"> Supabase JWT — email verification, at </w:t>
+        <w:t xml:space="preserve"> bawat booking ay may </w:t>
       </w:r>
       <w:r>
         <w:rPr>
           <w:b/>
           <w:i w:val="0"/>
         </w:rPr>
-        <w:t>OTP step-up kapag bagong device</w:t>
+        <w:t>time window</w:t>
       </w:r>
       <w:r>
         <w:rPr>
           <w:b w:val="0"/>
           <w:i w:val="0"/>
         </w:rPr>
-        <w:t xml:space="preserve"> ang login.</w:t>
+        <w:t xml:space="preserve"> — laging tsek bago ang bawat bagong booking, kaya </w:t>
+      </w:r>
+      <w:r>
+        <w:rPr>
+          <w:b/>
+          <w:i w:val="0"/>
+        </w:rPr>
+        <w:t>impossible ang double booking</w:t>
+      </w:r>
+      <w:r>
+        <w:rPr>
+          <w:b w:val="0"/>
+          <w:i w:val="0"/>
+        </w:rPr>
+        <w:t xml:space="preserve"> — overnight man o day-use. Kanina ito napatunayan nang live: </w:t>
+      </w:r>
+      <w:r>
+        <w:rPr>
+          <w:b/>
+          <w:i w:val="0"/>
+        </w:rPr>
+        <w:t>BLOCKED</w:t>
+      </w:r>
+      <w:r>
+        <w:rPr>
+          <w:b w:val="0"/>
+          <w:i w:val="0"/>
+        </w:rPr>
+        <w:t xml:space="preserve"> ang parehong room.</w:t>
       </w:r>
     </w:p>
     <w:p>
@@ -3977,28 +4144,42 @@
           <w:b/>
           <w:i w:val="0"/>
         </w:rPr>
-        <w:t>Payments:</w:t>
+        <w:t>Walk-in flow:</w:t>
       </w:r>
       <w:r>
         <w:rPr>
           <w:b w:val="0"/>
           <w:i w:val="0"/>
         </w:rPr>
-        <w:t xml:space="preserve"> PayMongo — full payment, downpayment, at </w:t>
+        <w:t xml:space="preserve"> ginagawa ng admin sa counter → </w:t>
       </w:r>
       <w:r>
         <w:rPr>
           <w:b/>
           <w:i w:val="0"/>
         </w:rPr>
-        <w:t>automatic refund</w:t>
+        <w:t>Cash</w:t>
       </w:r>
       <w:r>
         <w:rPr>
           <w:b w:val="0"/>
           <w:i w:val="0"/>
         </w:rPr>
-        <w:t xml:space="preserve"> sa cancellation.</w:t>
+        <w:t xml:space="preserve"> ang bayad → </w:t>
+      </w:r>
+      <w:r>
+        <w:rPr>
+          <w:b/>
+          <w:i w:val="0"/>
+        </w:rPr>
+        <w:t>auto in-house</w:t>
+      </w:r>
+      <w:r>
+        <w:rPr>
+          <w:b w:val="0"/>
+          <w:i w:val="0"/>
+        </w:rPr>
+        <w:t xml:space="preserve"> agad — hindi na kailangang i-scan pa ang QR kasi nasa harap na ang guest.</w:t>
       </w:r>
     </w:p>
     <w:p>
@@ -4018,28 +4199,152 @@
           <w:b/>
           <w:i w:val="0"/>
         </w:rPr>
-        <w:t>Data:</w:t>
+        <w:t>Cancellation:</w:t>
       </w:r>
       <w:r>
         <w:rPr>
           <w:b w:val="0"/>
           <w:i w:val="0"/>
         </w:rPr>
-        <w:t xml:space="preserve"> ~</w:t>
+        <w:t xml:space="preserve"> guest lang ang makakansela (</w:t>
       </w:r>
       <w:r>
         <w:rPr>
           <w:b/>
           <w:i w:val="0"/>
         </w:rPr>
-        <w:t>1,300+ booking</w:t>
+        <w:t>24-hour rule</w:t>
       </w:r>
       <w:r>
         <w:rPr>
           <w:b w:val="0"/>
           <w:i w:val="0"/>
         </w:rPr>
-        <w:t xml:space="preserve"> na ang naka-process nito — may server-side pagination at exact counts.</w:t>
+        <w:t xml:space="preserve">) → </w:t>
+      </w:r>
+      <w:r>
+        <w:rPr>
+          <w:b/>
+          <w:i w:val="0"/>
+        </w:rPr>
+        <w:t>automatic ang refund</w:t>
+      </w:r>
+      <w:r>
+        <w:rPr>
+          <w:b w:val="0"/>
+          <w:i w:val="0"/>
+        </w:rPr>
+        <w:t xml:space="preserve"> sa original payment (7–14 banking days). Ang admin: check-in, complete, manage — walang pwersahang cancel.</w:t>
+      </w:r>
+    </w:p>
+    <w:p>
+      <w:pPr>
+        <w:spacing w:after="60"/>
+        <w:ind w:left="432"/>
+      </w:pPr>
+      <w:r>
+        <w:rPr>
+          <w:b w:val="0"/>
+          <w:i w:val="0"/>
+        </w:rPr>
+        <w:t xml:space="preserve">•  </w:t>
+      </w:r>
+      <w:r>
+        <w:rPr>
+          <w:b/>
+          <w:i w:val="0"/>
+        </w:rPr>
+        <w:t>Seguridad:</w:t>
+      </w:r>
+      <w:r>
+        <w:rPr>
+          <w:b w:val="0"/>
+          <w:i w:val="0"/>
+        </w:rPr>
+        <w:t xml:space="preserve"> email verification, </w:t>
+      </w:r>
+      <w:r>
+        <w:rPr>
+          <w:b/>
+          <w:i w:val="0"/>
+        </w:rPr>
+        <w:t>OTP kapag bagong device</w:t>
+      </w:r>
+      <w:r>
+        <w:rPr>
+          <w:b w:val="0"/>
+          <w:i w:val="0"/>
+        </w:rPr>
+        <w:t xml:space="preserve"> mag-login, at hiwalay na kapangyarihan ng </w:t>
+      </w:r>
+      <w:r>
+        <w:rPr>
+          <w:b/>
+          <w:i w:val="0"/>
+        </w:rPr>
+        <w:t>guest</w:t>
+      </w:r>
+      <w:r>
+        <w:rPr>
+          <w:b w:val="0"/>
+          <w:i w:val="0"/>
+        </w:rPr>
+        <w:t xml:space="preserve"> at </w:t>
+      </w:r>
+      <w:r>
+        <w:rPr>
+          <w:b/>
+          <w:i w:val="0"/>
+        </w:rPr>
+        <w:t>admin</w:t>
+      </w:r>
+      <w:r>
+        <w:rPr>
+          <w:b w:val="0"/>
+          <w:i w:val="0"/>
+        </w:rPr>
+        <w:t>.</w:t>
+      </w:r>
+    </w:p>
+    <w:p>
+      <w:pPr>
+        <w:spacing w:after="60"/>
+        <w:ind w:left="432"/>
+      </w:pPr>
+      <w:r>
+        <w:rPr>
+          <w:b w:val="0"/>
+          <w:i w:val="0"/>
+        </w:rPr>
+        <w:t xml:space="preserve">•  </w:t>
+      </w:r>
+      <w:r>
+        <w:rPr>
+          <w:b/>
+          <w:i w:val="0"/>
+        </w:rPr>
+        <w:t>AI:</w:t>
+      </w:r>
+      <w:r>
+        <w:rPr>
+          <w:b w:val="0"/>
+          <w:i w:val="0"/>
+        </w:rPr>
+        <w:t xml:space="preserve"> sumasagot at nagre-recommend batay sa </w:t>
+      </w:r>
+      <w:r>
+        <w:rPr>
+          <w:b/>
+          <w:i w:val="0"/>
+        </w:rPr>
+        <w:t>totoong datos ng hotel</w:t>
+      </w:r>
+      <w:r>
+        <w:rPr>
+          <w:b w:val="0"/>
+          <w:i w:val="0"/>
+        </w:rPr>
+        <w:t xml:space="preserve"> — bookings, presyo, at occupancy — hindi canned answers.</w:t>
       </w:r>
     </w:p>
     <w:p>
@@ -4217,7 +4522,7 @@
                 <w:i w:val="0"/>
                 <w:sz w:val="20"/>
               </w:rPr>
-              <w:t>database mismo</w:t>
+              <w:t>sistema mismo</w:t>
             </w:r>
             <w:r>
               <w:rPr>
@@ -4225,7 +4530,7 @@
                 <w:i w:val="0"/>
                 <w:sz w:val="20"/>
               </w:rPr>
-              <w:t xml:space="preserve">: PostgreSQL </w:t>
+              <w:t xml:space="preserve">, hindi lang sa screen: bago ang bawat booking, tinitsek ang </w:t>
             </w:r>
             <w:r>
               <w:rPr>
@@ -4233,7 +4538,7 @@
                 <w:i w:val="0"/>
                 <w:sz w:val="20"/>
               </w:rPr>
-              <w:t>exclusion constraint</w:t>
+              <w:t>time window</w:t>
             </w:r>
             <w:r>
               <w:rPr>
@@ -4241,7 +4546,55 @@
                 <w:i w:val="0"/>
                 <w:sz w:val="20"/>
               </w:rPr>
-              <w:t xml:space="preserve"> (`bookings_no_overlap`) gamit ang time range (`booking_window()`), sakop ang </w:t>
+              <w:t xml:space="preserve"> ng room — kapag may naunang booking sa parehong araw/oras, </w:t>
+            </w:r>
+            <w:r>
+              <w:rPr>
+                <w:b/>
+                <w:i w:val="0"/>
+                <w:sz w:val="20"/>
+              </w:rPr>
+              <w:t>talagang tinatanggihan</w:t>
+            </w:r>
+            <w:r>
+              <w:rPr>
+                <w:b w:val="0"/>
+                <w:i w:val="0"/>
+                <w:sz w:val="20"/>
+              </w:rPr>
+              <w:t xml:space="preserve"> ito. May </w:t>
+            </w:r>
+            <w:r>
+              <w:rPr>
+                <w:b/>
+                <w:i w:val="0"/>
+                <w:sz w:val="20"/>
+              </w:rPr>
+              <w:t>guard sa database</w:t>
+            </w:r>
+            <w:r>
+              <w:rPr>
+                <w:b w:val="0"/>
+                <w:i w:val="0"/>
+                <w:sz w:val="20"/>
+              </w:rPr>
+              <w:t xml:space="preserve"> kaya kahit sabay pang dalawang device ang mag-submit, </w:t>
+            </w:r>
+            <w:r>
+              <w:rPr>
+                <w:b/>
+                <w:i w:val="0"/>
+                <w:sz w:val="20"/>
+              </w:rPr>
+              <w:t>isang lang</w:t>
+            </w:r>
+            <w:r>
+              <w:rPr>
+                <w:b w:val="0"/>
+                <w:i w:val="0"/>
+                <w:sz w:val="20"/>
+              </w:rPr>
+              <w:t xml:space="preserve"> ang papapasukin. Sakop ang </w:t>
             </w:r>
             <w:r>
               <w:rPr>
@@ -4257,7 +4610,7 @@
                 <w:i w:val="0"/>
                 <w:sz w:val="20"/>
               </w:rPr>
-              <w:t>. Kahit100 sabay na request, isang lang ang pwedeng pumasok sa parehong window — race-proof.</w:t>
+              <w:t xml:space="preserve"> — at kanina ninyo itong napatunayan nang live.</w:t>
             </w:r>
           </w:p>
         </w:tc>
@@ -4417,7 +4770,7 @@
                 <w:i w:val="0"/>
                 <w:sz w:val="20"/>
               </w:rPr>
-              <w:t xml:space="preserve">Server-side pagination + exact counts (na-bypass ang </w:t>
+              <w:t xml:space="preserve">Bawat listahan ay </w:t>
             </w:r>
             <w:r>
               <w:rPr>
@@ -4425,7 +4778,7 @@
                 <w:i w:val="0"/>
                 <w:sz w:val="20"/>
               </w:rPr>
-              <w:t>1,000-row cap</w:t>
+              <w:t>naka-load nang maayos at tama</w:t>
             </w:r>
             <w:r>
               <w:rPr>
@@ -4433,7 +4786,7 @@
                 <w:i w:val="0"/>
                 <w:sz w:val="20"/>
               </w:rPr>
-              <w:t xml:space="preserve"> ng Supabase), at may short server cache (30–60s) para mabilis ang dashboard.</w:t>
+              <w:t xml:space="preserve"> kahit libo-libong booking — tamang bilang ang bawat count at walang nawawalang record, kaya mabilis at mapagkakatiwalaan ang dashboard.</w:t>
             </w:r>
           </w:p>
         </w:tc>
@@ -4682,7 +5035,23 @@
                 <w:i w:val="0"/>
                 <w:sz w:val="20"/>
               </w:rPr>
-              <w:t xml:space="preserve">Tingnan kung buhay ang `npm run dev` → </w:t>
+              <w:t xml:space="preserve">Siguraduhing naka-set up at gumagana na ang system </w:t>
+            </w:r>
+            <w:r>
+              <w:rPr>
+                <w:b/>
+                <w:i w:val="0"/>
+                <w:sz w:val="20"/>
+              </w:rPr>
+              <w:t>bago</w:t>
+            </w:r>
+            <w:r>
+              <w:rPr>
+                <w:b w:val="0"/>
+                <w:i w:val="0"/>
+                <w:sz w:val="20"/>
+              </w:rPr>
+              <w:t xml:space="preserve"> ang demo → </w:t>
             </w:r>
             <w:r>
               <w:rPr>
@@ -4734,7 +5103,7 @@
                 <w:i w:val="0"/>
                 <w:sz w:val="20"/>
               </w:rPr>
-              <w:t xml:space="preserve">Token expires ~1 oras — mag-login nang </w:t>
+              <w:t xml:space="preserve">Mag-login nang </w:t>
             </w:r>
             <w:r>
               <w:rPr>
@@ -4750,7 +5119,7 @@
                 <w:i w:val="0"/>
                 <w:sz w:val="20"/>
               </w:rPr>
-              <w:t xml:space="preserve"> ang demo. Kung na-lock, gamitin ang fallback admin account.</w:t>
+              <w:t xml:space="preserve"> ang demo (may nag-e-expire na session kapag matagal na nakabukas). Kung na-lock, gamitin ang fallback admin account.</w:t>
             </w:r>
           </w:p>
         </w:tc>
@@ -4836,23 +5205,7 @@
                 <w:i w:val="0"/>
                 <w:sz w:val="20"/>
               </w:rPr>
-              <w:t xml:space="preserve">May </w:t>
-            </w:r>
-            <w:r>
-              <w:rPr>
-                <w:b/>
-                <w:i w:val="0"/>
-                <w:sz w:val="20"/>
-              </w:rPr>
-              <w:t>30–60s server cache</w:t>
-            </w:r>
-            <w:r>
-              <w:rPr>
-                <w:b w:val="0"/>
-                <w:i w:val="0"/>
-                <w:sz w:val="20"/>
-              </w:rPr>
-              <w:t xml:space="preserve"> — normal. Hintayin lang o galawin ang filter.</w:t>
+              <w:t>Minsan may maunting delay bago mag-update ang mga numero — normal. Hintayin lang o galawin ang filter.</w:t>
             </w:r>
           </w:p>
         </w:tc>
@@ -4930,7 +5283,23 @@
                 <w:i w:val="0"/>
                 <w:sz w:val="20"/>
               </w:rPr>
-              <w:t xml:space="preserve"> Ipaliwanag na galing sa DB ang block. </w:t>
+              <w:t xml:space="preserve"> Ipaliwanag na ang </w:t>
+            </w:r>
+            <w:r>
+              <w:rPr>
+                <w:b/>
+                <w:i w:val="0"/>
+                <w:sz w:val="20"/>
+              </w:rPr>
+              <w:t>sistema mismo</w:t>
+            </w:r>
+            <w:r>
+              <w:rPr>
+                <w:b w:val="0"/>
+                <w:i w:val="0"/>
+                <w:sz w:val="20"/>
+              </w:rPr>
+              <w:t xml:space="preserve"> ang pumipigil, hindi lang ang screen. </w:t>
             </w:r>
           </w:p>
         </w:tc>
@@ -5059,7 +5428,7 @@
           <w:b w:val="0"/>
           <w:i w:val="0"/>
         </w:rPr>
-        <w:t xml:space="preserve"> problema → solusyon → stack → bridge kay Person 2.</w:t>
+        <w:t xml:space="preserve"> problema → solusyon → kaya ng system → bridge kay Person 2.</w:t>
       </w:r>
     </w:p>
     <w:p>
@@ -5196,7 +5565,7 @@
           <w:b w:val="0"/>
           <w:i w:val="0"/>
         </w:rPr>
-        <w:t xml:space="preserve"> architecture → AI → </w:t>
+        <w:t xml:space="preserve"> paano gumagana ang system → AI → </w:t>
       </w:r>
       <w:r>
         <w:rPr>

</xml_diff>